<commit_message>
add technologies section before removing tex
</commit_message>
<xml_diff>
--- a/resume/peterh_resume.docx
+++ b/resume/peterh_resume.docx
@@ -260,6 +260,24 @@
         <w:t xml:space="preserve">Guided engineering teams through cross-team refinement, architecture review, and delivery of integration use cases.</w:t>
       </w:r>
     </w:p>
+    <w:p>
+      <w:pPr>
+        <w:pStyle w:val="FirstParagraph"/>
+      </w:pPr>
+      <w:r>
+        <w:rPr>
+          <w:b/>
+          <w:bCs/>
+        </w:rPr>
+        <w:t xml:space="preserve">Technologies:</w:t>
+      </w:r>
+      <w:r>
+        <w:t xml:space="preserve"> </w:t>
+      </w:r>
+      <w:r>
+        <w:t xml:space="preserve">AWS (Step Functions, Lambda, API Gateway, EventBridge, S3, DynamoDB, CloudWatch), GitHub Actions, .NET, Terraform, CQRS, Event Sourcing</w:t>
+      </w:r>
+    </w:p>
     <w:tbl>
       <w:tblPr>
         <w:tblStyle w:val="Table"/>
@@ -346,6 +364,24 @@
         <w:t xml:space="preserve">Achieved 3rd place in the Endava Australia Innovation Lab for an AI baggage-counting solution.</w:t>
       </w:r>
     </w:p>
+    <w:p>
+      <w:pPr>
+        <w:pStyle w:val="FirstParagraph"/>
+      </w:pPr>
+      <w:r>
+        <w:rPr>
+          <w:b/>
+          <w:bCs/>
+        </w:rPr>
+        <w:t xml:space="preserve">Technologies:</w:t>
+      </w:r>
+      <w:r>
+        <w:t xml:space="preserve"> </w:t>
+      </w:r>
+      <w:r>
+        <w:t xml:space="preserve">AWS (EC2, S3, Lambda, SageMaker), Python, PyTorch, OpenCV, Google Gemini Pro, LangChain, RAG</w:t>
+      </w:r>
+    </w:p>
     <w:tbl>
       <w:tblPr>
         <w:tblStyle w:val="Table"/>
@@ -421,6 +457,24 @@
         <w:t xml:space="preserve">Led development teams in Vietnam and Australia to deliver software releases by adopting Model-Based Systems Engineering (MBSE) to complement V-model systems engineering implementation.</w:t>
       </w:r>
     </w:p>
+    <w:p>
+      <w:pPr>
+        <w:pStyle w:val="FirstParagraph"/>
+      </w:pPr>
+      <w:r>
+        <w:rPr>
+          <w:b/>
+          <w:bCs/>
+        </w:rPr>
+        <w:t xml:space="preserve">Technologies:</w:t>
+      </w:r>
+      <w:r>
+        <w:t xml:space="preserve"> </w:t>
+      </w:r>
+      <w:r>
+        <w:t xml:space="preserve">AWS (IoT Core, CloudWatch), C/C++, Python, 4G/LTE, MBSE, V-Model</w:t>
+      </w:r>
+    </w:p>
     <w:tbl>
       <w:tblPr>
         <w:tblStyle w:val="Table"/>
@@ -526,6 +580,24 @@
         <w:t xml:space="preserve">Collaborated with the Norwegian University of Science and Technology to develop quadcopter guidance and navigation simulation software for reinforcement learning research.</w:t>
       </w:r>
     </w:p>
+    <w:p>
+      <w:pPr>
+        <w:pStyle w:val="FirstParagraph"/>
+      </w:pPr>
+      <w:r>
+        <w:rPr>
+          <w:b/>
+          <w:bCs/>
+        </w:rPr>
+        <w:t xml:space="preserve">Technologies:</w:t>
+      </w:r>
+      <w:r>
+        <w:t xml:space="preserve"> </w:t>
+      </w:r>
+      <w:r>
+        <w:t xml:space="preserve">AWS (Lambda, API Gateway, S3, DynamoDB, SQS, CloudFormation), Python, Node.js, React, EDI/X12, OR-Tools</w:t>
+      </w:r>
+    </w:p>
     <w:tbl>
       <w:tblPr>
         <w:tblStyle w:val="Table"/>
@@ -653,6 +725,24 @@
         <w:t xml:space="preserve">Significantly reduced manual effort, typically 20 person-hours for a 100-hectare field, in robot optimal work-plan creation by designing an algorithm to automatically generate path plans from surveyed geometries.</w:t>
       </w:r>
     </w:p>
+    <w:p>
+      <w:pPr>
+        <w:pStyle w:val="FirstParagraph"/>
+      </w:pPr>
+      <w:r>
+        <w:rPr>
+          <w:b/>
+          <w:bCs/>
+        </w:rPr>
+        <w:t xml:space="preserve">Technologies:</w:t>
+      </w:r>
+      <w:r>
+        <w:t xml:space="preserve"> </w:t>
+      </w:r>
+      <w:r>
+        <w:t xml:space="preserve">C++, Python, AWS (API Gateway, Lambda, S3), React, PostgreSQL, Docker, QGIS</w:t>
+      </w:r>
+    </w:p>
     <w:tbl>
       <w:tblPr>
         <w:tblStyle w:val="Table"/>
@@ -802,6 +892,24 @@
         <w:t xml:space="preserve">Finished as the second runner-up in a machine learning business innovation competition by developing a prototype vision-based lane-marker detection system using semantic segmentation for road-quality analysis.</w:t>
       </w:r>
     </w:p>
+    <w:p>
+      <w:pPr>
+        <w:pStyle w:val="FirstParagraph"/>
+      </w:pPr>
+      <w:r>
+        <w:rPr>
+          <w:b/>
+          <w:bCs/>
+        </w:rPr>
+        <w:t xml:space="preserve">Technologies:</w:t>
+      </w:r>
+      <w:r>
+        <w:t xml:space="preserve"> </w:t>
+      </w:r>
+      <w:r>
+        <w:t xml:space="preserve">C++, Python, ROS, RViz, DeckGL, OpenCV, PCL, Eigen, Ceres, Docker, lidar, radar, GPS, ultrasonic sensors</w:t>
+      </w:r>
+    </w:p>
     <w:tbl>
       <w:tblPr>
         <w:tblStyle w:val="Table"/>
@@ -918,6 +1026,24 @@
         <w:t xml:space="preserve">Served as lead engineer for the Video Assist 4K product and successfully delivered and demonstrated 3D LUT video color-correction preview and multilingual display and update features at CES 2017.</w:t>
       </w:r>
     </w:p>
+    <w:p>
+      <w:pPr>
+        <w:pStyle w:val="FirstParagraph"/>
+      </w:pPr>
+      <w:r>
+        <w:rPr>
+          <w:b/>
+          <w:bCs/>
+        </w:rPr>
+        <w:t xml:space="preserve">Technologies:</w:t>
+      </w:r>
+      <w:r>
+        <w:t xml:space="preserve"> </w:t>
+      </w:r>
+      <w:r>
+        <w:t xml:space="preserve">C/C++, Objective-C, QNX, embedded RTOS, OpenGL, serial/Ethernet protocols, multi-threaded programming</w:t>
+      </w:r>
+    </w:p>
     <w:tbl>
       <w:tblPr>
         <w:tblStyle w:val="Table"/>
@@ -1038,6 +1164,24 @@
       </w:pPr>
       <w:r>
         <w:t xml:space="preserve">Performed critical troubleshooting on a half-million-dollar “Black Start”500 kVA power generator for a Queensland water treatment plant.</w:t>
+      </w:r>
+    </w:p>
+    <w:p>
+      <w:pPr>
+        <w:pStyle w:val="FirstParagraph"/>
+      </w:pPr>
+      <w:r>
+        <w:rPr>
+          <w:b/>
+          <w:bCs/>
+        </w:rPr>
+        <w:t xml:space="preserve">Technologies:</w:t>
+      </w:r>
+      <w:r>
+        <w:t xml:space="preserve"> </w:t>
+      </w:r>
+      <w:r>
+        <w:t xml:space="preserve">C, Qt, FreeRTOS, embedded systems, PCB design, Altium, LabView, PLC</w:t>
       </w:r>
     </w:p>
     <w:bookmarkEnd w:id="13"/>

</xml_diff>